<commit_message>
Test equation review in LibreOffice and fix multi-column layout there
</commit_message>
<xml_diff>
--- a/test/docx/libreoffice-accepted.docx
+++ b/test/docx/libreoffice-accepted.docx
@@ -6,7 +6,7 @@
       <w:pPr>
         <w:pStyle w:val="Normal"/>
         <w:spacing w:lineRule="auto" w:line="259" w:before="0" w:after="168"/>
-        <w:ind w:hanging="0" w:left="0"/>
+        <w:ind w:hanging="0" w:left="2001" w:right="2001"/>
         <w:jc w:val="left"/>
         <w:rPr/>
       </w:pPr>
@@ -28,7 +28,7 @@
           <w:tab w:val="center" w:pos="3716" w:leader="none"/>
         </w:tabs>
         <w:spacing w:lineRule="auto" w:line="259" w:before="0" w:after="173"/>
-        <w:ind w:hanging="0" w:left="0"/>
+        <w:ind w:hanging="0" w:left="2001" w:right="2001"/>
         <w:jc w:val="left"/>
         <w:rPr/>
       </w:pPr>
@@ -54,6 +54,7 @@
       <w:pPr>
         <w:pStyle w:val="Normal"/>
         <w:spacing w:lineRule="auto" w:line="259" w:before="0" w:after="173"/>
+        <w:ind w:hanging="10" w:left="2001" w:right="2001"/>
         <w:jc w:val="center"/>
         <w:rPr/>
       </w:pPr>
@@ -69,7 +70,7 @@
         <w:sectPr>
           <w:type w:val="nextPage"/>
           <w:pgSz w:w="12240" w:h="15840"/>
-          <w:pgMar w:left="3441" w:right="3456" w:gutter="0" w:header="0" w:top="3094" w:footer="0" w:bottom="1440"/>
+          <w:pgMar w:left="1440" w:right="1455" w:gutter="0" w:header="0" w:top="3094" w:footer="0" w:bottom="1440"/>
           <w:pgNumType w:fmt="decimal"/>
           <w:formProt w:val="false"/>
           <w:textDirection w:val="lrTb"/>
@@ -238,87 +239,249 @@
         <w:rPr/>
       </w:r>
     </w:p>
-    <w:p>
-      <w:pPr>
-        <w:pStyle w:val="Normal"/>
-        <w:tabs>
-          <w:tab w:val="clear" w:pos="720"/>
-          <w:tab w:val="center" w:pos="2284" w:leader="none"/>
-          <w:tab w:val="right" w:pos="4573" w:leader="none"/>
-        </w:tabs>
-        <w:spacing w:lineRule="auto" w:line="259" w:before="0" w:after="243"/>
-        <w:ind w:hanging="0" w:left="0"/>
+    <w:tbl>
+      <w:tblPr>
+        <w:tblW w:w="4647" w:type="dxa"/>
         <w:jc w:val="left"/>
-        <w:rPr/>
-      </w:pPr>
-      <w:r>
-        <w:rPr>
-          <w:rFonts w:eastAsia="Calibri" w:cs="Calibri" w:ascii="Calibri" w:hAnsi="Calibri"/>
-          <w:sz w:val="22"/>
-        </w:rPr>
-        <w:tab/>
-      </w:r>
-      <w:r>
-        <w:rPr/>
-        <w:drawing>
-          <wp:inline distT="0" distB="0" distL="0" distR="0">
-            <wp:extent cx="1161415" cy="299085"/>
-            <wp:effectExtent l="0" t="0" r="0" b="0"/>
-            <wp:docPr id="1" name="Picture 1788"/>
-            <wp:cNvGraphicFramePr>
-              <a:graphicFrameLocks xmlns:a="http://schemas.openxmlformats.org/drawingml/2006/main" noChangeAspect="1"/>
-            </wp:cNvGraphicFramePr>
-            <a:graphic xmlns:a="http://schemas.openxmlformats.org/drawingml/2006/main">
-              <a:graphicData uri="http://schemas.openxmlformats.org/drawingml/2006/picture">
-                <pic:pic xmlns:pic="http://schemas.openxmlformats.org/drawingml/2006/picture">
-                  <pic:nvPicPr>
-                    <pic:cNvPr id="1" name="Picture 1788"/>
-                    <pic:cNvPicPr>
-                      <a:picLocks noChangeAspect="1" noChangeArrowheads="1"/>
-                    </pic:cNvPicPr>
-                  </pic:nvPicPr>
-                  <pic:blipFill>
-                    <a:blip r:embed="rId2"/>
-                    <a:stretch>
-                      <a:fillRect/>
-                    </a:stretch>
-                  </pic:blipFill>
-                  <pic:spPr bwMode="auto">
-                    <a:xfrm>
-                      <a:off x="0" y="0"/>
-                      <a:ext cx="1161415" cy="299085"/>
-                    </a:xfrm>
-                    <a:prstGeom prst="rect">
-                      <a:avLst/>
-                    </a:prstGeom>
-                    <a:noFill/>
-                  </pic:spPr>
-                </pic:pic>
-              </a:graphicData>
-            </a:graphic>
-          </wp:inline>
-        </w:drawing>
-      </w:r>
-      <w:r>
-        <w:rPr>
-          <w:i/>
-        </w:rPr>
-        <w:t>,</w:t>
-        <w:tab/>
-      </w:r>
-      <w:r>
-        <w:rPr/>
-        <w:t>(1)</w:t>
-      </w:r>
-    </w:p>
+        <w:tblInd w:w="108" w:type="dxa"/>
+        <w:tblLayout w:type="fixed"/>
+        <w:tblCellMar>
+          <w:top w:w="0" w:type="dxa"/>
+          <w:left w:w="108" w:type="dxa"/>
+          <w:bottom w:w="0" w:type="dxa"/>
+          <w:right w:w="108" w:type="dxa"/>
+        </w:tblCellMar>
+      </w:tblPr>
+      <w:tblGrid>
+        <w:gridCol w:w="579"/>
+        <w:gridCol w:w="3488"/>
+        <w:gridCol w:w="580"/>
+      </w:tblGrid>
+      <w:tr>
+        <w:trPr/>
+        <w:tc>
+          <w:tcPr>
+            <w:tcW w:w="579" w:type="dxa"/>
+            <w:tcBorders/>
+            <w:vAlign w:val="center"/>
+          </w:tcPr>
+          <w:p>
+            <w:pPr>
+              <w:pStyle w:val="Normal"/>
+              <w:spacing w:before="60" w:after="60"/>
+              <w:rPr/>
+            </w:pPr>
+            <w:r>
+              <w:rPr/>
+            </w:r>
+          </w:p>
+        </w:tc>
+        <w:tc>
+          <w:tcPr>
+            <w:tcW w:w="3488" w:type="dxa"/>
+            <w:tcBorders/>
+            <w:vAlign w:val="center"/>
+          </w:tcPr>
+          <w:p>
+            <w:pPr>
+              <w:pStyle w:val="Normal"/>
+              <w:spacing w:before="60" w:after="60"/>
+              <w:jc w:val="center"/>
+              <w:rPr/>
+            </w:pPr>
+            <w:bookmarkStart w:id="9" w:name="ck_dcf9e526_15"/>
+            <w:r>
+              <w:rPr/>
+            </w:r>
+            <m:oMathPara xmlns:m="http://schemas.openxmlformats.org/officeDocument/2006/math">
+              <m:oMathParaPr>
+                <m:jc m:val="center"/>
+              </m:oMathParaPr>
+              <m:oMath>
+                <m:f>
+                  <m:num>
+                    <m:r>
+                      <w:rPr>
+                        <w:rFonts w:ascii="Cambria Math" w:hAnsi="Cambria Math"/>
+                      </w:rPr>
+                      <m:t xml:space="preserve">Δ</m:t>
+                    </m:r>
+                    <m:r>
+                      <w:rPr>
+                        <w:rFonts w:ascii="Cambria Math" w:hAnsi="Cambria Math"/>
+                      </w:rPr>
+                      <m:t xml:space="preserve">U</m:t>
+                    </m:r>
+                  </m:num>
+                  <m:den>
+                    <m:sSub>
+                      <m:e>
+                        <m:r>
+                          <w:rPr>
+                            <w:rFonts w:ascii="Cambria Math" w:hAnsi="Cambria Math"/>
+                          </w:rPr>
+                          <m:t xml:space="preserve">U</m:t>
+                        </m:r>
+                      </m:e>
+                      <m:sub>
+                        <m:r>
+                          <w:rPr>
+                            <w:rFonts w:ascii="Cambria Math" w:hAnsi="Cambria Math"/>
+                          </w:rPr>
+                          <m:t xml:space="preserve">∞</m:t>
+                        </m:r>
+                      </m:sub>
+                    </m:sSub>
+                  </m:den>
+                </m:f>
+                <m:r>
+                  <m:rPr>
+                    <m:lit/>
+                    <m:nor/>
+                  </m:rPr>
+                  <w:rPr>
+                    <w:rFonts w:ascii="Cambria Math" w:hAnsi="Cambria Math"/>
+                  </w:rPr>
+                  <m:t xml:space="preserve">=</m:t>
+                </m:r>
+                <m:f>
+                  <m:num>
+                    <m:sSub>
+                      <m:e>
+                        <m:r>
+                          <w:rPr>
+                            <w:rFonts w:ascii="Cambria Math" w:hAnsi="Cambria Math"/>
+                          </w:rPr>
+                          <m:t xml:space="preserve">C</m:t>
+                        </m:r>
+                      </m:e>
+                      <m:sub>
+                        <m:r>
+                          <w:rPr>
+                            <w:rFonts w:ascii="Cambria Math" w:hAnsi="Cambria Math"/>
+                          </w:rPr>
+                          <m:t xml:space="preserve">P</m:t>
+                        </m:r>
+                      </m:sub>
+                    </m:sSub>
+                  </m:num>
+                  <m:den>
+                    <m:r>
+                      <w:rPr>
+                        <w:rFonts w:ascii="Cambria Math" w:hAnsi="Cambria Math"/>
+                      </w:rPr>
+                      <m:t xml:space="preserve">8</m:t>
+                    </m:r>
+                    <m:r>
+                      <w:rPr>
+                        <w:rFonts w:ascii="Cambria Math" w:hAnsi="Cambria Math"/>
+                      </w:rPr>
+                      <m:t xml:space="preserve">(</m:t>
+                    </m:r>
+                    <m:r>
+                      <w:rPr>
+                        <w:rFonts w:ascii="Cambria Math" w:hAnsi="Cambria Math"/>
+                      </w:rPr>
+                      <m:t xml:space="preserve">1</m:t>
+                    </m:r>
+                    <m:r>
+                      <m:rPr>
+                        <m:lit/>
+                        <m:nor/>
+                      </m:rPr>
+                      <w:rPr>
+                        <w:rFonts w:ascii="Cambria Math" w:hAnsi="Cambria Math"/>
+                      </w:rPr>
+                      <m:t xml:space="preserve">+</m:t>
+                    </m:r>
+                    <m:r>
+                      <w:rPr>
+                        <w:rFonts w:ascii="Cambria Math" w:hAnsi="Cambria Math"/>
+                      </w:rPr>
+                      <m:t xml:space="preserve">k</m:t>
+                    </m:r>
+                    <m:r>
+                      <w:rPr>
+                        <w:rFonts w:ascii="Cambria Math" w:hAnsi="Cambria Math"/>
+                      </w:rPr>
+                      <m:t xml:space="preserve">x</m:t>
+                    </m:r>
+                    <m:r>
+                      <m:rPr>
+                        <m:lit/>
+                        <m:nor/>
+                      </m:rPr>
+                      <w:rPr>
+                        <w:rFonts w:ascii="Cambria Math" w:hAnsi="Cambria Math"/>
+                      </w:rPr>
+                      <m:t xml:space="preserve">/</m:t>
+                    </m:r>
+                    <m:r>
+                      <w:rPr>
+                        <w:rFonts w:ascii="Cambria Math" w:hAnsi="Cambria Math"/>
+                      </w:rPr>
+                      <m:t xml:space="preserve">D</m:t>
+                    </m:r>
+                    <m:sSup>
+                      <m:e>
+                        <m:r>
+                          <w:rPr>
+                            <w:rFonts w:ascii="Cambria Math" w:hAnsi="Cambria Math"/>
+                          </w:rPr>
+                          <m:t xml:space="preserve">)</m:t>
+                        </m:r>
+                      </m:e>
+                      <m:sup>
+                        <m:r>
+                          <w:rPr>
+                            <w:rFonts w:ascii="Cambria Math" w:hAnsi="Cambria Math"/>
+                          </w:rPr>
+                          <m:t xml:space="preserve">2</m:t>
+                        </m:r>
+                      </m:sup>
+                    </m:sSup>
+                  </m:den>
+                </m:f>
+                <m:r>
+                  <w:rPr>
+                    <w:rFonts w:ascii="Cambria Math" w:hAnsi="Cambria Math"/>
+                  </w:rPr>
+                  <m:t xml:space="preserve">,</m:t>
+                </m:r>
+              </m:oMath>
+            </m:oMathPara>
+            <w:bookmarkEnd w:id="9"/>
+          </w:p>
+        </w:tc>
+        <w:tc>
+          <w:tcPr>
+            <w:tcW w:w="580" w:type="dxa"/>
+            <w:tcBorders/>
+            <w:vAlign w:val="center"/>
+          </w:tcPr>
+          <w:p>
+            <w:pPr>
+              <w:pStyle w:val="Normal"/>
+              <w:spacing w:before="60" w:after="60"/>
+              <w:jc w:val="right"/>
+              <w:rPr/>
+            </w:pPr>
+            <w:r>
+              <w:rPr/>
+              <w:t>(1)</w:t>
+            </w:r>
+          </w:p>
+        </w:tc>
+      </w:tr>
+    </w:tbl>
     <w:p>
       <w:pPr>
         <w:pStyle w:val="Normal"/>
         <w:ind w:hanging="10" w:left="-5"/>
         <w:rPr/>
       </w:pPr>
-      <w:bookmarkStart w:id="9" w:name="ck_dcf9e526_18"/>
-      <w:bookmarkEnd w:id="9"/>
+      <w:bookmarkStart w:id="10" w:name="ck_dcf9e526_19"/>
+      <w:bookmarkEnd w:id="10"/>
       <w:r>
         <w:rPr/>
         <w:t xml:space="preserve">where </w:t>
@@ -367,7 +530,7 @@
               <wp:inline distT="0" distB="0" distL="0" distR="0">
                 <wp:extent cx="2345055" cy="1697990"/>
                 <wp:effectExtent l="0" t="0" r="0" b="0"/>
-                <wp:docPr id="2" name="Group 1448"/>
+                <wp:docPr id="1" name="Group 1448"/>
                 <a:graphic xmlns:a="http://schemas.openxmlformats.org/drawingml/2006/main">
                   <a:graphicData uri="http://schemas.microsoft.com/office/word/2010/wordprocessingGroup">
                     <wpg:wgp>
@@ -381,24 +544,18 @@
                         </a:xfrm>
                       </wpg:grpSpPr>
                       <wps:wsp>
-                        <wps:cNvPr id="3" name="Shape 64"/>
+                        <wps:cNvPr id="2" name="Shape 64"/>
                         <wps:cNvSpPr/>
                         <wps:spPr>
                           <a:xfrm>
-                            <a:off x="411480" y="1483200"/>
-                            <a:ext cx="720" cy="18360"/>
+                            <a:off x="411480" y="1482840"/>
+                            <a:ext cx="720" cy="19080"/>
                           </a:xfrm>
                           <a:custGeom>
                             <a:avLst/>
-                            <a:gdLst>
-                              <a:gd name="textAreaLeft" fmla="*/ 0 w 360"/>
-                              <a:gd name="textAreaRight" fmla="*/ 720 w 360"/>
-                              <a:gd name="textAreaTop" fmla="*/ 0 h 10440"/>
-                              <a:gd name="textAreaBottom" fmla="*/ 10800 h 10440"/>
-                            </a:gdLst>
+                            <a:gdLst/>
                             <a:ahLst/>
-                            <a:cxnLst/>
-                            <a:rect l="textAreaLeft" t="textAreaTop" r="textAreaRight" b="textAreaBottom"/>
+                            <a:rect l="l" t="t" r="r" b="b"/>
                             <a:pathLst>
                               <a:path w="0" h="19850">
                                 <a:moveTo>
@@ -430,12 +587,12 @@
                         <wps:bodyPr/>
                       </wps:wsp>
                       <wps:wsp>
-                        <wps:cNvPr id="4" name="Rectangle 65"/>
+                        <wps:cNvPr id="3" name="Rectangle 65"/>
                         <wps:cNvSpPr/>
                         <wps:spPr>
                           <a:xfrm>
-                            <a:off x="393840" y="1496160"/>
-                            <a:ext cx="47160" cy="123840"/>
+                            <a:off x="393840" y="1495440"/>
+                            <a:ext cx="47520" cy="124560"/>
                           </a:xfrm>
                           <a:prstGeom prst="rect">
                             <a:avLst/>
@@ -477,24 +634,18 @@
                         </wps:bodyPr>
                       </wps:wsp>
                       <wps:wsp>
-                        <wps:cNvPr id="5" name="Shape 66"/>
+                        <wps:cNvPr id="4" name="Shape 66"/>
                         <wps:cNvSpPr/>
                         <wps:spPr>
                           <a:xfrm>
-                            <a:off x="779760" y="1483200"/>
-                            <a:ext cx="720" cy="18360"/>
+                            <a:off x="779760" y="1482840"/>
+                            <a:ext cx="720" cy="19080"/>
                           </a:xfrm>
                           <a:custGeom>
                             <a:avLst/>
-                            <a:gdLst>
-                              <a:gd name="textAreaLeft" fmla="*/ 0 w 360"/>
-                              <a:gd name="textAreaRight" fmla="*/ 720 w 360"/>
-                              <a:gd name="textAreaTop" fmla="*/ 0 h 10440"/>
-                              <a:gd name="textAreaBottom" fmla="*/ 10800 h 10440"/>
-                            </a:gdLst>
+                            <a:gdLst/>
                             <a:ahLst/>
-                            <a:cxnLst/>
-                            <a:rect l="textAreaLeft" t="textAreaTop" r="textAreaRight" b="textAreaBottom"/>
+                            <a:rect l="l" t="t" r="r" b="b"/>
                             <a:pathLst>
                               <a:path w="0" h="19850">
                                 <a:moveTo>
@@ -526,12 +677,12 @@
                         <wps:bodyPr/>
                       </wps:wsp>
                       <wps:wsp>
-                        <wps:cNvPr id="6" name="Rectangle 67"/>
+                        <wps:cNvPr id="5" name="Rectangle 67"/>
                         <wps:cNvSpPr/>
                         <wps:spPr>
                           <a:xfrm>
-                            <a:off x="762120" y="1496160"/>
-                            <a:ext cx="47160" cy="123840"/>
+                            <a:off x="762120" y="1495440"/>
+                            <a:ext cx="47520" cy="124560"/>
                           </a:xfrm>
                           <a:prstGeom prst="rect">
                             <a:avLst/>
@@ -573,24 +724,18 @@
                         </wps:bodyPr>
                       </wps:wsp>
                       <wps:wsp>
-                        <wps:cNvPr id="7" name="Shape 68"/>
+                        <wps:cNvPr id="6" name="Shape 68"/>
                         <wps:cNvSpPr/>
                         <wps:spPr>
                           <a:xfrm>
-                            <a:off x="1148040" y="1483200"/>
-                            <a:ext cx="720" cy="18360"/>
+                            <a:off x="1148040" y="1482840"/>
+                            <a:ext cx="720" cy="19080"/>
                           </a:xfrm>
                           <a:custGeom>
                             <a:avLst/>
-                            <a:gdLst>
-                              <a:gd name="textAreaLeft" fmla="*/ 0 w 360"/>
-                              <a:gd name="textAreaRight" fmla="*/ 720 w 360"/>
-                              <a:gd name="textAreaTop" fmla="*/ 0 h 10440"/>
-                              <a:gd name="textAreaBottom" fmla="*/ 10800 h 10440"/>
-                            </a:gdLst>
+                            <a:gdLst/>
                             <a:ahLst/>
-                            <a:cxnLst/>
-                            <a:rect l="textAreaLeft" t="textAreaTop" r="textAreaRight" b="textAreaBottom"/>
+                            <a:rect l="l" t="t" r="r" b="b"/>
                             <a:pathLst>
                               <a:path w="0" h="19850">
                                 <a:moveTo>
@@ -622,12 +767,12 @@
                         <wps:bodyPr/>
                       </wps:wsp>
                       <wps:wsp>
-                        <wps:cNvPr id="8" name="Rectangle 69"/>
+                        <wps:cNvPr id="7" name="Rectangle 69"/>
                         <wps:cNvSpPr/>
                         <wps:spPr>
                           <a:xfrm>
-                            <a:off x="1130400" y="1496160"/>
-                            <a:ext cx="46440" cy="123840"/>
+                            <a:off x="1130400" y="1495440"/>
+                            <a:ext cx="47160" cy="124560"/>
                           </a:xfrm>
                           <a:prstGeom prst="rect">
                             <a:avLst/>
@@ -669,24 +814,18 @@
                         </wps:bodyPr>
                       </wps:wsp>
                       <wps:wsp>
-                        <wps:cNvPr id="9" name="Shape 70"/>
+                        <wps:cNvPr id="8" name="Shape 70"/>
                         <wps:cNvSpPr/>
                         <wps:spPr>
                           <a:xfrm>
-                            <a:off x="1515600" y="1483200"/>
-                            <a:ext cx="720" cy="18360"/>
+                            <a:off x="1515600" y="1482840"/>
+                            <a:ext cx="720" cy="19080"/>
                           </a:xfrm>
                           <a:custGeom>
                             <a:avLst/>
-                            <a:gdLst>
-                              <a:gd name="textAreaLeft" fmla="*/ 0 w 360"/>
-                              <a:gd name="textAreaRight" fmla="*/ 720 w 360"/>
-                              <a:gd name="textAreaTop" fmla="*/ 0 h 10440"/>
-                              <a:gd name="textAreaBottom" fmla="*/ 10800 h 10440"/>
-                            </a:gdLst>
+                            <a:gdLst/>
                             <a:ahLst/>
-                            <a:cxnLst/>
-                            <a:rect l="textAreaLeft" t="textAreaTop" r="textAreaRight" b="textAreaBottom"/>
+                            <a:rect l="l" t="t" r="r" b="b"/>
                             <a:pathLst>
                               <a:path w="0" h="19850">
                                 <a:moveTo>
@@ -718,12 +857,12 @@
                         <wps:bodyPr/>
                       </wps:wsp>
                       <wps:wsp>
-                        <wps:cNvPr id="10" name="Rectangle 71"/>
+                        <wps:cNvPr id="9" name="Rectangle 71"/>
                         <wps:cNvSpPr/>
                         <wps:spPr>
                           <a:xfrm>
-                            <a:off x="1497960" y="1496160"/>
-                            <a:ext cx="47160" cy="123840"/>
+                            <a:off x="1497960" y="1495440"/>
+                            <a:ext cx="47520" cy="124560"/>
                           </a:xfrm>
                           <a:prstGeom prst="rect">
                             <a:avLst/>
@@ -765,24 +904,18 @@
                         </wps:bodyPr>
                       </wps:wsp>
                       <wps:wsp>
-                        <wps:cNvPr id="11" name="Shape 72"/>
+                        <wps:cNvPr id="10" name="Shape 72"/>
                         <wps:cNvSpPr/>
                         <wps:spPr>
                           <a:xfrm>
-                            <a:off x="1883880" y="1483200"/>
-                            <a:ext cx="720" cy="18360"/>
+                            <a:off x="1883880" y="1482840"/>
+                            <a:ext cx="720" cy="19080"/>
                           </a:xfrm>
                           <a:custGeom>
                             <a:avLst/>
-                            <a:gdLst>
-                              <a:gd name="textAreaLeft" fmla="*/ 0 w 360"/>
-                              <a:gd name="textAreaRight" fmla="*/ 720 w 360"/>
-                              <a:gd name="textAreaTop" fmla="*/ 0 h 10440"/>
-                              <a:gd name="textAreaBottom" fmla="*/ 10800 h 10440"/>
-                            </a:gdLst>
+                            <a:gdLst/>
                             <a:ahLst/>
-                            <a:cxnLst/>
-                            <a:rect l="textAreaLeft" t="textAreaTop" r="textAreaRight" b="textAreaBottom"/>
+                            <a:rect l="l" t="t" r="r" b="b"/>
                             <a:pathLst>
                               <a:path w="0" h="19850">
                                 <a:moveTo>
@@ -814,12 +947,12 @@
                         <wps:bodyPr/>
                       </wps:wsp>
                       <wps:wsp>
-                        <wps:cNvPr id="12" name="Rectangle 73"/>
+                        <wps:cNvPr id="11" name="Rectangle 73"/>
                         <wps:cNvSpPr/>
                         <wps:spPr>
                           <a:xfrm>
-                            <a:off x="1866240" y="1496160"/>
-                            <a:ext cx="47160" cy="123840"/>
+                            <a:off x="1866240" y="1495440"/>
+                            <a:ext cx="47520" cy="124560"/>
                           </a:xfrm>
                           <a:prstGeom prst="rect">
                             <a:avLst/>
@@ -861,24 +994,18 @@
                         </wps:bodyPr>
                       </wps:wsp>
                       <wps:wsp>
-                        <wps:cNvPr id="13" name="Shape 74"/>
+                        <wps:cNvPr id="12" name="Shape 74"/>
                         <wps:cNvSpPr/>
                         <wps:spPr>
                           <a:xfrm>
-                            <a:off x="2252520" y="1483200"/>
-                            <a:ext cx="720" cy="18360"/>
+                            <a:off x="2252520" y="1482840"/>
+                            <a:ext cx="720" cy="19080"/>
                           </a:xfrm>
                           <a:custGeom>
                             <a:avLst/>
-                            <a:gdLst>
-                              <a:gd name="textAreaLeft" fmla="*/ 0 w 360"/>
-                              <a:gd name="textAreaRight" fmla="*/ 720 w 360"/>
-                              <a:gd name="textAreaTop" fmla="*/ 0 h 10440"/>
-                              <a:gd name="textAreaBottom" fmla="*/ 10800 h 10440"/>
-                            </a:gdLst>
+                            <a:gdLst/>
                             <a:ahLst/>
-                            <a:cxnLst/>
-                            <a:rect l="textAreaLeft" t="textAreaTop" r="textAreaRight" b="textAreaBottom"/>
+                            <a:rect l="l" t="t" r="r" b="b"/>
                             <a:pathLst>
                               <a:path w="0" h="19850">
                                 <a:moveTo>
@@ -910,12 +1037,12 @@
                         <wps:bodyPr/>
                       </wps:wsp>
                       <wps:wsp>
-                        <wps:cNvPr id="14" name="Rectangle 75"/>
+                        <wps:cNvPr id="13" name="Rectangle 75"/>
                         <wps:cNvSpPr/>
                         <wps:spPr>
                           <a:xfrm>
-                            <a:off x="2216160" y="1496160"/>
-                            <a:ext cx="94680" cy="123840"/>
+                            <a:off x="2216160" y="1495440"/>
+                            <a:ext cx="95400" cy="124560"/>
                           </a:xfrm>
                           <a:prstGeom prst="rect">
                             <a:avLst/>
@@ -957,12 +1084,12 @@
                         </wps:bodyPr>
                       </wps:wsp>
                       <wps:wsp>
-                        <wps:cNvPr id="15" name="Rectangle 76"/>
+                        <wps:cNvPr id="14" name="Rectangle 76"/>
                         <wps:cNvSpPr/>
                         <wps:spPr>
                           <a:xfrm>
-                            <a:off x="1315080" y="1574280"/>
-                            <a:ext cx="43200" cy="123840"/>
+                            <a:off x="1315080" y="1573560"/>
+                            <a:ext cx="43920" cy="124560"/>
                           </a:xfrm>
                           <a:prstGeom prst="rect">
                             <a:avLst/>
@@ -1004,24 +1131,18 @@
                         </wps:bodyPr>
                       </wps:wsp>
                       <wps:wsp>
-                        <wps:cNvPr id="16" name="Shape 77"/>
+                        <wps:cNvPr id="15" name="Shape 77"/>
                         <wps:cNvSpPr/>
                         <wps:spPr>
                           <a:xfrm>
-                            <a:off x="299880" y="1415880"/>
-                            <a:ext cx="18360" cy="720"/>
+                            <a:off x="299880" y="1415520"/>
+                            <a:ext cx="19080" cy="720"/>
                           </a:xfrm>
                           <a:custGeom>
                             <a:avLst/>
-                            <a:gdLst>
-                              <a:gd name="textAreaLeft" fmla="*/ 0 w 10440"/>
-                              <a:gd name="textAreaRight" fmla="*/ 10800 w 10440"/>
-                              <a:gd name="textAreaTop" fmla="*/ 0 h 360"/>
-                              <a:gd name="textAreaBottom" fmla="*/ 720 h 360"/>
-                            </a:gdLst>
+                            <a:gdLst/>
                             <a:ahLst/>
-                            <a:cxnLst/>
-                            <a:rect l="textAreaLeft" t="textAreaTop" r="textAreaRight" b="textAreaBottom"/>
+                            <a:rect l="l" t="t" r="r" b="b"/>
                             <a:pathLst>
                               <a:path w="19850" h="0">
                                 <a:moveTo>
@@ -1053,12 +1174,12 @@
                         <wps:bodyPr/>
                       </wps:wsp>
                       <wps:wsp>
-                        <wps:cNvPr id="17" name="Rectangle 78"/>
+                        <wps:cNvPr id="16" name="Rectangle 78"/>
                         <wps:cNvSpPr/>
                         <wps:spPr>
                           <a:xfrm>
-                            <a:off x="106200" y="1368360"/>
-                            <a:ext cx="62280" cy="124560"/>
+                            <a:off x="106200" y="1367640"/>
+                            <a:ext cx="63000" cy="124920"/>
                           </a:xfrm>
                           <a:prstGeom prst="rect">
                             <a:avLst/>
@@ -1100,12 +1221,12 @@
                         </wps:bodyPr>
                       </wps:wsp>
                       <wps:wsp>
-                        <wps:cNvPr id="18" name="Rectangle 79"/>
+                        <wps:cNvPr id="17" name="Rectangle 79"/>
                         <wps:cNvSpPr/>
                         <wps:spPr>
                           <a:xfrm>
-                            <a:off x="153720" y="1368360"/>
-                            <a:ext cx="166320" cy="124560"/>
+                            <a:off x="153720" y="1367640"/>
+                            <a:ext cx="167040" cy="124920"/>
                           </a:xfrm>
                           <a:prstGeom prst="rect">
                             <a:avLst/>
@@ -1147,24 +1268,18 @@
                         </wps:bodyPr>
                       </wps:wsp>
                       <wps:wsp>
-                        <wps:cNvPr id="19" name="Shape 80"/>
+                        <wps:cNvPr id="18" name="Shape 80"/>
                         <wps:cNvSpPr/>
                         <wps:spPr>
                           <a:xfrm>
-                            <a:off x="299880" y="1247760"/>
-                            <a:ext cx="18360" cy="720"/>
+                            <a:off x="299880" y="1247040"/>
+                            <a:ext cx="19080" cy="720"/>
                           </a:xfrm>
                           <a:custGeom>
                             <a:avLst/>
-                            <a:gdLst>
-                              <a:gd name="textAreaLeft" fmla="*/ 0 w 10440"/>
-                              <a:gd name="textAreaRight" fmla="*/ 10800 w 10440"/>
-                              <a:gd name="textAreaTop" fmla="*/ 0 h 360"/>
-                              <a:gd name="textAreaBottom" fmla="*/ 720 h 360"/>
-                            </a:gdLst>
+                            <a:gdLst/>
                             <a:ahLst/>
-                            <a:cxnLst/>
-                            <a:rect l="textAreaLeft" t="textAreaTop" r="textAreaRight" b="textAreaBottom"/>
+                            <a:rect l="l" t="t" r="r" b="b"/>
                             <a:pathLst>
                               <a:path w="19850" h="0">
                                 <a:moveTo>
@@ -1196,12 +1311,12 @@
                         <wps:bodyPr/>
                       </wps:wsp>
                       <wps:wsp>
-                        <wps:cNvPr id="20" name="Rectangle 81"/>
+                        <wps:cNvPr id="19" name="Rectangle 81"/>
                         <wps:cNvSpPr/>
                         <wps:spPr>
                           <a:xfrm>
-                            <a:off x="106200" y="1200240"/>
-                            <a:ext cx="62280" cy="124560"/>
+                            <a:off x="106200" y="1199520"/>
+                            <a:ext cx="63000" cy="124920"/>
                           </a:xfrm>
                           <a:prstGeom prst="rect">
                             <a:avLst/>
@@ -1243,12 +1358,12 @@
                         </wps:bodyPr>
                       </wps:wsp>
                       <wps:wsp>
-                        <wps:cNvPr id="21" name="Rectangle 82"/>
+                        <wps:cNvPr id="20" name="Rectangle 82"/>
                         <wps:cNvSpPr/>
                         <wps:spPr>
                           <a:xfrm>
-                            <a:off x="153720" y="1200240"/>
-                            <a:ext cx="166320" cy="124560"/>
+                            <a:off x="153720" y="1199520"/>
+                            <a:ext cx="167040" cy="124920"/>
                           </a:xfrm>
                           <a:prstGeom prst="rect">
                             <a:avLst/>
@@ -1290,24 +1405,18 @@
                         </wps:bodyPr>
                       </wps:wsp>
                       <wps:wsp>
-                        <wps:cNvPr id="22" name="Shape 83"/>
+                        <wps:cNvPr id="21" name="Shape 83"/>
                         <wps:cNvSpPr/>
                         <wps:spPr>
                           <a:xfrm>
-                            <a:off x="299880" y="1079640"/>
-                            <a:ext cx="18360" cy="720"/>
+                            <a:off x="299880" y="1078920"/>
+                            <a:ext cx="19080" cy="720"/>
                           </a:xfrm>
                           <a:custGeom>
                             <a:avLst/>
-                            <a:gdLst>
-                              <a:gd name="textAreaLeft" fmla="*/ 0 w 10440"/>
-                              <a:gd name="textAreaRight" fmla="*/ 10800 w 10440"/>
-                              <a:gd name="textAreaTop" fmla="*/ 0 h 360"/>
-                              <a:gd name="textAreaBottom" fmla="*/ 720 h 360"/>
-                            </a:gdLst>
+                            <a:gdLst/>
                             <a:ahLst/>
-                            <a:cxnLst/>
-                            <a:rect l="textAreaLeft" t="textAreaTop" r="textAreaRight" b="textAreaBottom"/>
+                            <a:rect l="l" t="t" r="r" b="b"/>
                             <a:pathLst>
                               <a:path w="19850" h="0">
                                 <a:moveTo>
@@ -1339,12 +1448,12 @@
                         <wps:bodyPr/>
                       </wps:wsp>
                       <wps:wsp>
-                        <wps:cNvPr id="23" name="Rectangle 84"/>
+                        <wps:cNvPr id="22" name="Rectangle 84"/>
                         <wps:cNvSpPr/>
                         <wps:spPr>
                           <a:xfrm>
-                            <a:off x="106200" y="1031760"/>
-                            <a:ext cx="62280" cy="123840"/>
+                            <a:off x="106200" y="1031400"/>
+                            <a:ext cx="63000" cy="124560"/>
                           </a:xfrm>
                           <a:prstGeom prst="rect">
                             <a:avLst/>
@@ -1386,12 +1495,12 @@
                         </wps:bodyPr>
                       </wps:wsp>
                       <wps:wsp>
-                        <wps:cNvPr id="24" name="Rectangle 85"/>
+                        <wps:cNvPr id="23" name="Rectangle 85"/>
                         <wps:cNvSpPr/>
                         <wps:spPr>
                           <a:xfrm>
-                            <a:off x="153720" y="1031760"/>
-                            <a:ext cx="166320" cy="123840"/>
+                            <a:off x="153720" y="1031400"/>
+                            <a:ext cx="167040" cy="124560"/>
                           </a:xfrm>
                           <a:prstGeom prst="rect">
                             <a:avLst/>
@@ -1433,24 +1542,18 @@
                         </wps:bodyPr>
                       </wps:wsp>
                       <wps:wsp>
-                        <wps:cNvPr id="25" name="Shape 86"/>
+                        <wps:cNvPr id="24" name="Shape 86"/>
                         <wps:cNvSpPr/>
                         <wps:spPr>
                           <a:xfrm>
-                            <a:off x="299880" y="910440"/>
-                            <a:ext cx="18360" cy="720"/>
+                            <a:off x="299880" y="910080"/>
+                            <a:ext cx="19080" cy="720"/>
                           </a:xfrm>
                           <a:custGeom>
                             <a:avLst/>
-                            <a:gdLst>
-                              <a:gd name="textAreaLeft" fmla="*/ 0 w 10440"/>
-                              <a:gd name="textAreaRight" fmla="*/ 10800 w 10440"/>
-                              <a:gd name="textAreaTop" fmla="*/ 0 h 360"/>
-                              <a:gd name="textAreaBottom" fmla="*/ 720 h 360"/>
-                            </a:gdLst>
+                            <a:gdLst/>
                             <a:ahLst/>
-                            <a:cxnLst/>
-                            <a:rect l="textAreaLeft" t="textAreaTop" r="textAreaRight" b="textAreaBottom"/>
+                            <a:rect l="l" t="t" r="r" b="b"/>
                             <a:pathLst>
                               <a:path w="19850" h="0">
                                 <a:moveTo>
@@ -1482,12 +1585,12 @@
                         <wps:bodyPr/>
                       </wps:wsp>
                       <wps:wsp>
-                        <wps:cNvPr id="26" name="Rectangle 87"/>
+                        <wps:cNvPr id="25" name="Rectangle 87"/>
                         <wps:cNvSpPr/>
                         <wps:spPr>
                           <a:xfrm>
-                            <a:off x="106200" y="863640"/>
-                            <a:ext cx="62280" cy="123840"/>
+                            <a:off x="106200" y="862920"/>
+                            <a:ext cx="63000" cy="124560"/>
                           </a:xfrm>
                           <a:prstGeom prst="rect">
                             <a:avLst/>
@@ -1529,12 +1632,12 @@
                         </wps:bodyPr>
                       </wps:wsp>
                       <wps:wsp>
-                        <wps:cNvPr id="27" name="Rectangle 88"/>
+                        <wps:cNvPr id="26" name="Rectangle 88"/>
                         <wps:cNvSpPr/>
                         <wps:spPr>
                           <a:xfrm>
-                            <a:off x="153720" y="863640"/>
-                            <a:ext cx="166320" cy="123840"/>
+                            <a:off x="153720" y="862920"/>
+                            <a:ext cx="167040" cy="124560"/>
                           </a:xfrm>
                           <a:prstGeom prst="rect">
                             <a:avLst/>
@@ -1576,24 +1679,18 @@
                         </wps:bodyPr>
                       </wps:wsp>
                       <wps:wsp>
-                        <wps:cNvPr id="28" name="Shape 89"/>
+                        <wps:cNvPr id="27" name="Shape 89"/>
                         <wps:cNvSpPr/>
                         <wps:spPr>
                           <a:xfrm>
                             <a:off x="299880" y="741600"/>
-                            <a:ext cx="18360" cy="720"/>
+                            <a:ext cx="19080" cy="720"/>
                           </a:xfrm>
                           <a:custGeom>
                             <a:avLst/>
-                            <a:gdLst>
-                              <a:gd name="textAreaLeft" fmla="*/ 0 w 10440"/>
-                              <a:gd name="textAreaRight" fmla="*/ 10800 w 10440"/>
-                              <a:gd name="textAreaTop" fmla="*/ 0 h 360"/>
-                              <a:gd name="textAreaBottom" fmla="*/ 720 h 360"/>
-                            </a:gdLst>
+                            <a:gdLst/>
                             <a:ahLst/>
-                            <a:cxnLst/>
-                            <a:rect l="textAreaLeft" t="textAreaTop" r="textAreaRight" b="textAreaBottom"/>
+                            <a:rect l="l" t="t" r="r" b="b"/>
                             <a:pathLst>
                               <a:path w="19850" h="0">
                                 <a:moveTo>
@@ -1625,12 +1722,12 @@
                         <wps:bodyPr/>
                       </wps:wsp>
                       <wps:wsp>
-                        <wps:cNvPr id="29" name="Rectangle 90"/>
+                        <wps:cNvPr id="28" name="Rectangle 90"/>
                         <wps:cNvSpPr/>
                         <wps:spPr>
                           <a:xfrm>
                             <a:off x="153720" y="693360"/>
-                            <a:ext cx="166320" cy="124560"/>
+                            <a:ext cx="167040" cy="124920"/>
                           </a:xfrm>
                           <a:prstGeom prst="rect">
                             <a:avLst/>
@@ -1672,24 +1769,18 @@
                         </wps:bodyPr>
                       </wps:wsp>
                       <wps:wsp>
-                        <wps:cNvPr id="30" name="Shape 91"/>
+                        <wps:cNvPr id="29" name="Shape 91"/>
                         <wps:cNvSpPr/>
                         <wps:spPr>
                           <a:xfrm>
                             <a:off x="299880" y="572760"/>
-                            <a:ext cx="18360" cy="720"/>
+                            <a:ext cx="19080" cy="720"/>
                           </a:xfrm>
                           <a:custGeom>
                             <a:avLst/>
-                            <a:gdLst>
-                              <a:gd name="textAreaLeft" fmla="*/ 0 w 10440"/>
-                              <a:gd name="textAreaRight" fmla="*/ 10800 w 10440"/>
-                              <a:gd name="textAreaTop" fmla="*/ 0 h 360"/>
-                              <a:gd name="textAreaBottom" fmla="*/ 720 h 360"/>
-                            </a:gdLst>
+                            <a:gdLst/>
                             <a:ahLst/>
-                            <a:cxnLst/>
-                            <a:rect l="textAreaLeft" t="textAreaTop" r="textAreaRight" b="textAreaBottom"/>
+                            <a:rect l="l" t="t" r="r" b="b"/>
                             <a:pathLst>
                               <a:path w="19850" h="0">
                                 <a:moveTo>
@@ -1721,12 +1812,12 @@
                         <wps:bodyPr/>
                       </wps:wsp>
                       <wps:wsp>
-                        <wps:cNvPr id="31" name="Rectangle 92"/>
+                        <wps:cNvPr id="30" name="Rectangle 92"/>
                         <wps:cNvSpPr/>
                         <wps:spPr>
                           <a:xfrm>
                             <a:off x="153720" y="525240"/>
-                            <a:ext cx="166320" cy="124560"/>
+                            <a:ext cx="167040" cy="124920"/>
                           </a:xfrm>
                           <a:prstGeom prst="rect">
                             <a:avLst/>
@@ -1768,24 +1859,18 @@
                         </wps:bodyPr>
                       </wps:wsp>
                       <wps:wsp>
-                        <wps:cNvPr id="32" name="Shape 93"/>
+                        <wps:cNvPr id="31" name="Shape 93"/>
                         <wps:cNvSpPr/>
                         <wps:spPr>
                           <a:xfrm>
                             <a:off x="299880" y="404640"/>
-                            <a:ext cx="18360" cy="720"/>
+                            <a:ext cx="19080" cy="720"/>
                           </a:xfrm>
                           <a:custGeom>
                             <a:avLst/>
-                            <a:gdLst>
-                              <a:gd name="textAreaLeft" fmla="*/ 0 w 10440"/>
-                              <a:gd name="textAreaRight" fmla="*/ 10800 w 10440"/>
-                              <a:gd name="textAreaTop" fmla="*/ 0 h 360"/>
-                              <a:gd name="textAreaBottom" fmla="*/ 720 h 360"/>
-                            </a:gdLst>
+                            <a:gdLst/>
                             <a:ahLst/>
-                            <a:cxnLst/>
-                            <a:rect l="textAreaLeft" t="textAreaTop" r="textAreaRight" b="textAreaBottom"/>
+                            <a:rect l="l" t="t" r="r" b="b"/>
                             <a:pathLst>
                               <a:path w="19850" h="0">
                                 <a:moveTo>
@@ -1817,12 +1902,12 @@
                         <wps:bodyPr/>
                       </wps:wsp>
                       <wps:wsp>
-                        <wps:cNvPr id="33" name="Rectangle 94"/>
+                        <wps:cNvPr id="32" name="Rectangle 94"/>
                         <wps:cNvSpPr/>
                         <wps:spPr>
                           <a:xfrm>
                             <a:off x="153720" y="356760"/>
-                            <a:ext cx="166320" cy="123840"/>
+                            <a:ext cx="167040" cy="124560"/>
                           </a:xfrm>
                           <a:prstGeom prst="rect">
                             <a:avLst/>
@@ -1864,24 +1949,18 @@
                         </wps:bodyPr>
                       </wps:wsp>
                       <wps:wsp>
-                        <wps:cNvPr id="34" name="Shape 95"/>
+                        <wps:cNvPr id="33" name="Shape 95"/>
                         <wps:cNvSpPr/>
                         <wps:spPr>
                           <a:xfrm>
                             <a:off x="299880" y="235440"/>
-                            <a:ext cx="18360" cy="720"/>
+                            <a:ext cx="19080" cy="720"/>
                           </a:xfrm>
                           <a:custGeom>
                             <a:avLst/>
-                            <a:gdLst>
-                              <a:gd name="textAreaLeft" fmla="*/ 0 w 10440"/>
-                              <a:gd name="textAreaRight" fmla="*/ 10800 w 10440"/>
-                              <a:gd name="textAreaTop" fmla="*/ 0 h 360"/>
-                              <a:gd name="textAreaBottom" fmla="*/ 720 h 360"/>
-                            </a:gdLst>
+                            <a:gdLst/>
                             <a:ahLst/>
-                            <a:cxnLst/>
-                            <a:rect l="textAreaLeft" t="textAreaTop" r="textAreaRight" b="textAreaBottom"/>
+                            <a:rect l="l" t="t" r="r" b="b"/>
                             <a:pathLst>
                               <a:path w="19850" h="0">
                                 <a:moveTo>
@@ -1913,12 +1992,12 @@
                         <wps:bodyPr/>
                       </wps:wsp>
                       <wps:wsp>
-                        <wps:cNvPr id="35" name="Rectangle 96"/>
+                        <wps:cNvPr id="34" name="Rectangle 96"/>
                         <wps:cNvSpPr/>
                         <wps:spPr>
                           <a:xfrm>
                             <a:off x="153720" y="188640"/>
-                            <a:ext cx="166320" cy="123840"/>
+                            <a:ext cx="167040" cy="124560"/>
                           </a:xfrm>
                           <a:prstGeom prst="rect">
                             <a:avLst/>
@@ -1960,24 +2039,18 @@
                         </wps:bodyPr>
                       </wps:wsp>
                       <wps:wsp>
-                        <wps:cNvPr id="36" name="Shape 97"/>
+                        <wps:cNvPr id="35" name="Shape 97"/>
                         <wps:cNvSpPr/>
                         <wps:spPr>
                           <a:xfrm>
                             <a:off x="299880" y="67320"/>
-                            <a:ext cx="18360" cy="720"/>
+                            <a:ext cx="19080" cy="720"/>
                           </a:xfrm>
                           <a:custGeom>
                             <a:avLst/>
-                            <a:gdLst>
-                              <a:gd name="textAreaLeft" fmla="*/ 0 w 10440"/>
-                              <a:gd name="textAreaRight" fmla="*/ 10800 w 10440"/>
-                              <a:gd name="textAreaTop" fmla="*/ 0 h 360"/>
-                              <a:gd name="textAreaBottom" fmla="*/ 720 h 360"/>
-                            </a:gdLst>
+                            <a:gdLst/>
                             <a:ahLst/>
-                            <a:cxnLst/>
-                            <a:rect l="textAreaLeft" t="textAreaTop" r="textAreaRight" b="textAreaBottom"/>
+                            <a:rect l="l" t="t" r="r" b="b"/>
                             <a:pathLst>
                               <a:path w="19850" h="0">
                                 <a:moveTo>
@@ -2009,12 +2082,12 @@
                         <wps:bodyPr/>
                       </wps:wsp>
                       <wps:wsp>
-                        <wps:cNvPr id="37" name="Rectangle 98"/>
+                        <wps:cNvPr id="36" name="Rectangle 98"/>
                         <wps:cNvSpPr/>
                         <wps:spPr>
                           <a:xfrm>
                             <a:off x="153720" y="19800"/>
-                            <a:ext cx="166320" cy="124560"/>
+                            <a:ext cx="167040" cy="124920"/>
                           </a:xfrm>
                           <a:prstGeom prst="rect">
                             <a:avLst/>
@@ -2056,12 +2129,12 @@
                         </wps:bodyPr>
                       </wps:wsp>
                       <wps:wsp>
-                        <wps:cNvPr id="38" name="Rectangle 99"/>
+                        <wps:cNvPr id="37" name="Rectangle 99"/>
                         <wps:cNvSpPr/>
                         <wps:spPr>
                           <a:xfrm rot="16200000">
-                            <a:off x="-22680" y="654480"/>
-                            <a:ext cx="172080" cy="126360"/>
+                            <a:off x="-22680" y="655200"/>
+                            <a:ext cx="172800" cy="127080"/>
                           </a:xfrm>
                           <a:prstGeom prst="rect">
                             <a:avLst/>
@@ -2117,24 +2190,18 @@
                         </wps:bodyPr>
                       </wps:wsp>
                       <wps:wsp>
-                        <wps:cNvPr id="39" name="Shape 100"/>
+                        <wps:cNvPr id="38" name="Shape 100"/>
                         <wps:cNvSpPr/>
                         <wps:spPr>
                           <a:xfrm>
                             <a:off x="411480" y="67320"/>
-                            <a:ext cx="1839600" cy="1347480"/>
+                            <a:ext cx="1840320" cy="1347480"/>
                           </a:xfrm>
                           <a:custGeom>
                             <a:avLst/>
-                            <a:gdLst>
-                              <a:gd name="textAreaLeft" fmla="*/ 0 w 1042920"/>
-                              <a:gd name="textAreaRight" fmla="*/ 1043280 w 1042920"/>
-                              <a:gd name="textAreaTop" fmla="*/ 0 h 763920"/>
-                              <a:gd name="textAreaBottom" fmla="*/ 764280 h 763920"/>
-                            </a:gdLst>
+                            <a:gdLst/>
                             <a:ahLst/>
-                            <a:cxnLst/>
-                            <a:rect l="textAreaLeft" t="textAreaTop" r="textAreaRight" b="textAreaBottom"/>
+                            <a:rect l="l" t="t" r="r" b="b"/>
                             <a:pathLst>
                               <a:path w="1841218" h="1372004">
                                 <a:moveTo>
@@ -2457,7 +2524,7 @@
                         <wps:bodyPr/>
                       </wps:wsp>
                       <wps:wsp>
-                        <wps:cNvPr id="40" name="Shape 101"/>
+                        <wps:cNvPr id="39" name="Shape 101"/>
                         <wps:cNvSpPr/>
                         <wps:spPr>
                           <a:xfrm>
@@ -2466,15 +2533,9 @@
                           </a:xfrm>
                           <a:custGeom>
                             <a:avLst/>
-                            <a:gdLst>
-                              <a:gd name="textAreaLeft" fmla="*/ 0 w 360"/>
-                              <a:gd name="textAreaRight" fmla="*/ 720 w 360"/>
-                              <a:gd name="textAreaTop" fmla="*/ 0 h 840240"/>
-                              <a:gd name="textAreaBottom" fmla="*/ 840600 h 840240"/>
-                            </a:gdLst>
+                            <a:gdLst/>
                             <a:ahLst/>
-                            <a:cxnLst/>
-                            <a:rect l="textAreaLeft" t="textAreaTop" r="textAreaRight" b="textAreaBottom"/>
+                            <a:rect l="l" t="t" r="r" b="b"/>
                             <a:pathLst>
                               <a:path w="0" h="1509204">
                                 <a:moveTo>
@@ -2502,7 +2563,7 @@
                         <wps:bodyPr/>
                       </wps:wsp>
                       <wps:wsp>
-                        <wps:cNvPr id="41" name="Shape 102"/>
+                        <wps:cNvPr id="40" name="Shape 102"/>
                         <wps:cNvSpPr/>
                         <wps:spPr>
                           <a:xfrm>
@@ -2511,15 +2572,9 @@
                           </a:xfrm>
                           <a:custGeom>
                             <a:avLst/>
-                            <a:gdLst>
-                              <a:gd name="textAreaLeft" fmla="*/ 0 w 360"/>
-                              <a:gd name="textAreaRight" fmla="*/ 720 w 360"/>
-                              <a:gd name="textAreaTop" fmla="*/ 0 h 840240"/>
-                              <a:gd name="textAreaBottom" fmla="*/ 840600 h 840240"/>
-                            </a:gdLst>
+                            <a:gdLst/>
                             <a:ahLst/>
-                            <a:cxnLst/>
-                            <a:rect l="textAreaLeft" t="textAreaTop" r="textAreaRight" b="textAreaBottom"/>
+                            <a:rect l="l" t="t" r="r" b="b"/>
                             <a:pathLst>
                               <a:path w="0" h="1509204">
                                 <a:moveTo>
@@ -2547,24 +2602,18 @@
                         <wps:bodyPr/>
                       </wps:wsp>
                       <wps:wsp>
-                        <wps:cNvPr id="42" name="Shape 103"/>
+                        <wps:cNvPr id="41" name="Shape 103"/>
                         <wps:cNvSpPr/>
                         <wps:spPr>
                           <a:xfrm>
-                            <a:off x="319320" y="1483200"/>
-                            <a:ext cx="2023920" cy="720"/>
+                            <a:off x="319320" y="1482840"/>
+                            <a:ext cx="2024280" cy="720"/>
                           </a:xfrm>
                           <a:custGeom>
                             <a:avLst/>
-                            <a:gdLst>
-                              <a:gd name="textAreaLeft" fmla="*/ 0 w 1147320"/>
-                              <a:gd name="textAreaRight" fmla="*/ 1147680 w 1147320"/>
-                              <a:gd name="textAreaTop" fmla="*/ 0 h 360"/>
-                              <a:gd name="textAreaBottom" fmla="*/ 720 h 360"/>
-                            </a:gdLst>
+                            <a:gdLst/>
                             <a:ahLst/>
-                            <a:cxnLst/>
-                            <a:rect l="textAreaLeft" t="textAreaTop" r="textAreaRight" b="textAreaBottom"/>
+                            <a:rect l="l" t="t" r="r" b="b"/>
                             <a:pathLst>
                               <a:path w="2025339" h="0">
                                 <a:moveTo>
@@ -2592,24 +2641,18 @@
                         <wps:bodyPr/>
                       </wps:wsp>
                       <wps:wsp>
-                        <wps:cNvPr id="43" name="Shape 104"/>
+                        <wps:cNvPr id="42" name="Shape 104"/>
                         <wps:cNvSpPr/>
                         <wps:spPr>
                           <a:xfrm>
                             <a:off x="319320" y="0"/>
-                            <a:ext cx="2023920" cy="720"/>
+                            <a:ext cx="2024280" cy="720"/>
                           </a:xfrm>
                           <a:custGeom>
                             <a:avLst/>
-                            <a:gdLst>
-                              <a:gd name="textAreaLeft" fmla="*/ 0 w 1147320"/>
-                              <a:gd name="textAreaRight" fmla="*/ 1147680 w 1147320"/>
-                              <a:gd name="textAreaTop" fmla="*/ 0 h 360"/>
-                              <a:gd name="textAreaBottom" fmla="*/ 720 h 360"/>
-                            </a:gdLst>
+                            <a:gdLst/>
                             <a:ahLst/>
-                            <a:cxnLst/>
-                            <a:rect l="textAreaLeft" t="textAreaTop" r="textAreaRight" b="textAreaBottom"/>
+                            <a:rect l="l" t="t" r="r" b="b"/>
                             <a:pathLst>
                               <a:path w="2025339" h="0">
                                 <a:moveTo>
@@ -2645,7 +2688,7 @@
           <mc:Fallback>
             <w:pict>
               <v:group id="shape_0" alt="Group 1448" style="position:absolute;margin-left:-1.8pt;margin-top:-133.75pt;width:186.45pt;height:133.7pt" coordorigin="-36,-2675" coordsize="3729,2674">
-                <v:rect id="shape_0" stroked="f" o:allowincell="f" style="position:absolute;left:620;top:-319;width:73;height:194;mso-wrap-style:square;v-text-anchor:top;mso-position-vertical:top">
+                <v:rect id="shape_0" stroked="f" o:allowincell="f" style="position:absolute;left:620;top:-320;width:74;height:195;mso-wrap-style:square;v-text-anchor:top;mso-position-vertical:top">
                   <v:fill o:detectmouseclick="t" on="false"/>
                   <v:stroke color="#3465a4" joinstyle="round" endcap="flat"/>
                   <v:textbox>
@@ -2671,7 +2714,7 @@
                   </v:textbox>
                   <w10:wrap type="square"/>
                 </v:rect>
-                <v:rect id="shape_0" stroked="f" o:allowincell="f" style="position:absolute;left:1200;top:-319;width:73;height:194;mso-wrap-style:square;v-text-anchor:top;mso-position-vertical:top">
+                <v:rect id="shape_0" stroked="f" o:allowincell="f" style="position:absolute;left:1200;top:-320;width:74;height:195;mso-wrap-style:square;v-text-anchor:top;mso-position-vertical:top">
                   <v:fill o:detectmouseclick="t" on="false"/>
                   <v:stroke color="#3465a4" joinstyle="round" endcap="flat"/>
                   <v:textbox>
@@ -2697,7 +2740,7 @@
                   </v:textbox>
                   <w10:wrap type="square"/>
                 </v:rect>
-                <v:rect id="shape_0" stroked="f" o:allowincell="f" style="position:absolute;left:1780;top:-319;width:72;height:194;mso-wrap-style:square;v-text-anchor:top;mso-position-vertical:top">
+                <v:rect id="shape_0" stroked="f" o:allowincell="f" style="position:absolute;left:1780;top:-320;width:73;height:195;mso-wrap-style:square;v-text-anchor:top;mso-position-vertical:top">
                   <v:fill o:detectmouseclick="t" on="false"/>
                   <v:stroke color="#3465a4" joinstyle="round" endcap="flat"/>
                   <v:textbox>
@@ -2723,7 +2766,7 @@
                   </v:textbox>
                   <w10:wrap type="square"/>
                 </v:rect>
-                <v:rect id="shape_0" stroked="f" o:allowincell="f" style="position:absolute;left:2359;top:-319;width:73;height:194;mso-wrap-style:square;v-text-anchor:top;mso-position-vertical:top">
+                <v:rect id="shape_0" stroked="f" o:allowincell="f" style="position:absolute;left:2359;top:-320;width:74;height:195;mso-wrap-style:square;v-text-anchor:top;mso-position-vertical:top">
                   <v:fill o:detectmouseclick="t" on="false"/>
                   <v:stroke color="#3465a4" joinstyle="round" endcap="flat"/>
                   <v:textbox>
@@ -2749,7 +2792,7 @@
                   </v:textbox>
                   <w10:wrap type="square"/>
                 </v:rect>
-                <v:rect id="shape_0" stroked="f" o:allowincell="f" style="position:absolute;left:2939;top:-319;width:73;height:194;mso-wrap-style:square;v-text-anchor:top;mso-position-vertical:top">
+                <v:rect id="shape_0" stroked="f" o:allowincell="f" style="position:absolute;left:2939;top:-320;width:74;height:195;mso-wrap-style:square;v-text-anchor:top;mso-position-vertical:top">
                   <v:fill o:detectmouseclick="t" on="false"/>
                   <v:stroke color="#3465a4" joinstyle="round" endcap="flat"/>
                   <v:textbox>
@@ -2775,7 +2818,7 @@
                   </v:textbox>
                   <w10:wrap type="square"/>
                 </v:rect>
-                <v:rect id="shape_0" stroked="f" o:allowincell="f" style="position:absolute;left:3490;top:-319;width:148;height:194;mso-wrap-style:square;v-text-anchor:top;mso-position-vertical:top">
+                <v:rect id="shape_0" stroked="f" o:allowincell="f" style="position:absolute;left:3490;top:-320;width:149;height:195;mso-wrap-style:square;v-text-anchor:top;mso-position-vertical:top">
                   <v:fill o:detectmouseclick="t" on="false"/>
                   <v:stroke color="#3465a4" joinstyle="round" endcap="flat"/>
                   <v:textbox>
@@ -2801,7 +2844,7 @@
                   </v:textbox>
                   <w10:wrap type="square"/>
                 </v:rect>
-                <v:rect id="shape_0" stroked="f" o:allowincell="f" style="position:absolute;left:2071;top:-196;width:67;height:194;mso-wrap-style:square;v-text-anchor:top;mso-position-vertical:top">
+                <v:rect id="shape_0" stroked="f" o:allowincell="f" style="position:absolute;left:2071;top:-197;width:68;height:195;mso-wrap-style:square;v-text-anchor:top;mso-position-vertical:top">
                   <v:fill o:detectmouseclick="t" on="false"/>
                   <v:stroke color="#3465a4" joinstyle="round" endcap="flat"/>
                   <v:textbox>
@@ -2827,7 +2870,7 @@
                   </v:textbox>
                   <w10:wrap type="square"/>
                 </v:rect>
-                <v:rect id="shape_0" stroked="f" o:allowincell="f" style="position:absolute;left:167;top:-520;width:97;height:195;mso-wrap-style:square;v-text-anchor:top;mso-position-vertical:top">
+                <v:rect id="shape_0" stroked="f" o:allowincell="f" style="position:absolute;left:167;top:-521;width:98;height:196;mso-wrap-style:square;v-text-anchor:top;mso-position-vertical:top">
                   <v:fill o:detectmouseclick="t" on="false"/>
                   <v:stroke color="#3465a4" joinstyle="round" endcap="flat"/>
                   <v:textbox>
@@ -2853,7 +2896,7 @@
                   </v:textbox>
                   <w10:wrap type="square"/>
                 </v:rect>
-                <v:rect id="shape_0" stroked="f" o:allowincell="f" style="position:absolute;left:242;top:-520;width:261;height:195;mso-wrap-style:square;v-text-anchor:top;mso-position-vertical:top">
+                <v:rect id="shape_0" stroked="f" o:allowincell="f" style="position:absolute;left:242;top:-521;width:262;height:196;mso-wrap-style:square;v-text-anchor:top;mso-position-vertical:top">
                   <v:fill o:detectmouseclick="t" on="false"/>
                   <v:stroke color="#3465a4" joinstyle="round" endcap="flat"/>
                   <v:textbox>
@@ -2879,7 +2922,7 @@
                   </v:textbox>
                   <w10:wrap type="square"/>
                 </v:rect>
-                <v:rect id="shape_0" stroked="f" o:allowincell="f" style="position:absolute;left:167;top:-785;width:97;height:195;mso-wrap-style:square;v-text-anchor:top;mso-position-vertical:top">
+                <v:rect id="shape_0" stroked="f" o:allowincell="f" style="position:absolute;left:167;top:-786;width:98;height:196;mso-wrap-style:square;v-text-anchor:top;mso-position-vertical:top">
                   <v:fill o:detectmouseclick="t" on="false"/>
                   <v:stroke color="#3465a4" joinstyle="round" endcap="flat"/>
                   <v:textbox>
@@ -2905,7 +2948,7 @@
                   </v:textbox>
                   <w10:wrap type="square"/>
                 </v:rect>
-                <v:rect id="shape_0" stroked="f" o:allowincell="f" style="position:absolute;left:242;top:-785;width:261;height:195;mso-wrap-style:square;v-text-anchor:top;mso-position-vertical:top">
+                <v:rect id="shape_0" stroked="f" o:allowincell="f" style="position:absolute;left:242;top:-786;width:262;height:196;mso-wrap-style:square;v-text-anchor:top;mso-position-vertical:top">
                   <v:fill o:detectmouseclick="t" on="false"/>
                   <v:stroke color="#3465a4" joinstyle="round" endcap="flat"/>
                   <v:textbox>
@@ -2931,7 +2974,7 @@
                   </v:textbox>
                   <w10:wrap type="square"/>
                 </v:rect>
-                <v:rect id="shape_0" stroked="f" o:allowincell="f" style="position:absolute;left:167;top:-1050;width:97;height:194;mso-wrap-style:square;v-text-anchor:top;mso-position-vertical:top">
+                <v:rect id="shape_0" stroked="f" o:allowincell="f" style="position:absolute;left:167;top:-1051;width:98;height:195;mso-wrap-style:square;v-text-anchor:top;mso-position-vertical:top">
                   <v:fill o:detectmouseclick="t" on="false"/>
                   <v:stroke color="#3465a4" joinstyle="round" endcap="flat"/>
                   <v:textbox>
@@ -2957,7 +3000,7 @@
                   </v:textbox>
                   <w10:wrap type="square"/>
                 </v:rect>
-                <v:rect id="shape_0" stroked="f" o:allowincell="f" style="position:absolute;left:242;top:-1050;width:261;height:194;mso-wrap-style:square;v-text-anchor:top;mso-position-vertical:top">
+                <v:rect id="shape_0" stroked="f" o:allowincell="f" style="position:absolute;left:242;top:-1051;width:262;height:195;mso-wrap-style:square;v-text-anchor:top;mso-position-vertical:top">
                   <v:fill o:detectmouseclick="t" on="false"/>
                   <v:stroke color="#3465a4" joinstyle="round" endcap="flat"/>
                   <v:textbox>
@@ -2983,7 +3026,7 @@
                   </v:textbox>
                   <w10:wrap type="square"/>
                 </v:rect>
-                <v:rect id="shape_0" stroked="f" o:allowincell="f" style="position:absolute;left:167;top:-1315;width:97;height:194;mso-wrap-style:square;v-text-anchor:top;mso-position-vertical:top">
+                <v:rect id="shape_0" stroked="f" o:allowincell="f" style="position:absolute;left:167;top:-1316;width:98;height:195;mso-wrap-style:square;v-text-anchor:top;mso-position-vertical:top">
                   <v:fill o:detectmouseclick="t" on="false"/>
                   <v:stroke color="#3465a4" joinstyle="round" endcap="flat"/>
                   <v:textbox>
@@ -3009,7 +3052,7 @@
                   </v:textbox>
                   <w10:wrap type="square"/>
                 </v:rect>
-                <v:rect id="shape_0" stroked="f" o:allowincell="f" style="position:absolute;left:242;top:-1315;width:261;height:194;mso-wrap-style:square;v-text-anchor:top;mso-position-vertical:top">
+                <v:rect id="shape_0" stroked="f" o:allowincell="f" style="position:absolute;left:242;top:-1316;width:262;height:195;mso-wrap-style:square;v-text-anchor:top;mso-position-vertical:top">
                   <v:fill o:detectmouseclick="t" on="false"/>
                   <v:stroke color="#3465a4" joinstyle="round" endcap="flat"/>
                   <v:textbox>
@@ -3035,7 +3078,7 @@
                   </v:textbox>
                   <w10:wrap type="square"/>
                 </v:rect>
-                <v:rect id="shape_0" stroked="f" o:allowincell="f" style="position:absolute;left:242;top:-1583;width:261;height:195;mso-wrap-style:square;v-text-anchor:top;mso-position-vertical:top">
+                <v:rect id="shape_0" stroked="f" o:allowincell="f" style="position:absolute;left:242;top:-1583;width:262;height:196;mso-wrap-style:square;v-text-anchor:top;mso-position-vertical:top">
                   <v:fill o:detectmouseclick="t" on="false"/>
                   <v:stroke color="#3465a4" joinstyle="round" endcap="flat"/>
                   <v:textbox>
@@ -3061,7 +3104,7 @@
                   </v:textbox>
                   <w10:wrap type="square"/>
                 </v:rect>
-                <v:rect id="shape_0" stroked="f" o:allowincell="f" style="position:absolute;left:242;top:-1848;width:261;height:195;mso-wrap-style:square;v-text-anchor:top;mso-position-vertical:top">
+                <v:rect id="shape_0" stroked="f" o:allowincell="f" style="position:absolute;left:242;top:-1848;width:262;height:196;mso-wrap-style:square;v-text-anchor:top;mso-position-vertical:top">
                   <v:fill o:detectmouseclick="t" on="false"/>
                   <v:stroke color="#3465a4" joinstyle="round" endcap="flat"/>
                   <v:textbox>
@@ -3087,7 +3130,7 @@
                   </v:textbox>
                   <w10:wrap type="square"/>
                 </v:rect>
-                <v:rect id="shape_0" stroked="f" o:allowincell="f" style="position:absolute;left:242;top:-2113;width:261;height:194;mso-wrap-style:square;v-text-anchor:top;mso-position-vertical:top">
+                <v:rect id="shape_0" stroked="f" o:allowincell="f" style="position:absolute;left:242;top:-2113;width:262;height:195;mso-wrap-style:square;v-text-anchor:top;mso-position-vertical:top">
                   <v:fill o:detectmouseclick="t" on="false"/>
                   <v:stroke color="#3465a4" joinstyle="round" endcap="flat"/>
                   <v:textbox>
@@ -3113,7 +3156,7 @@
                   </v:textbox>
                   <w10:wrap type="square"/>
                 </v:rect>
-                <v:rect id="shape_0" stroked="f" o:allowincell="f" style="position:absolute;left:242;top:-2378;width:261;height:194;mso-wrap-style:square;v-text-anchor:top;mso-position-vertical:top">
+                <v:rect id="shape_0" stroked="f" o:allowincell="f" style="position:absolute;left:242;top:-2378;width:262;height:195;mso-wrap-style:square;v-text-anchor:top;mso-position-vertical:top">
                   <v:fill o:detectmouseclick="t" on="false"/>
                   <v:stroke color="#3465a4" joinstyle="round" endcap="flat"/>
                   <v:textbox>
@@ -3139,7 +3182,7 @@
                   </v:textbox>
                   <w10:wrap type="square"/>
                 </v:rect>
-                <v:rect id="shape_0" stroked="f" o:allowincell="f" style="position:absolute;left:242;top:-2644;width:261;height:195;mso-wrap-style:square;v-text-anchor:top;mso-position-vertical:top">
+                <v:rect id="shape_0" stroked="f" o:allowincell="f" style="position:absolute;left:242;top:-2644;width:262;height:196;mso-wrap-style:square;v-text-anchor:top;mso-position-vertical:top">
                   <v:fill o:detectmouseclick="t" on="false"/>
                   <v:stroke color="#3465a4" joinstyle="round" endcap="flat"/>
                   <v:textbox>
@@ -3165,7 +3208,7 @@
                   </v:textbox>
                   <w10:wrap type="square"/>
                 </v:rect>
-                <v:rect id="shape_0" stroked="f" o:allowincell="f" style="position:absolute;left:-35;top:-1644;width:270;height:198;mso-wrap-style:square;v-text-anchor:top;rotation:270;mso-position-vertical:top">
+                <v:rect id="shape_0" stroked="f" o:allowincell="f" style="position:absolute;left:-35;top:-1643;width:271;height:199;mso-wrap-style:square;v-text-anchor:top;rotation:270;mso-position-vertical:top">
                   <v:fill o:detectmouseclick="t" on="false"/>
                   <v:stroke color="#3465a4" joinstyle="round" endcap="flat"/>
                   <v:textbox>
@@ -3218,8 +3261,8 @@
         <w:ind w:hanging="10" w:left="159"/>
         <w:rPr/>
       </w:pPr>
-      <w:bookmarkStart w:id="10" w:name="ck_defc3a7a_32"/>
-      <w:bookmarkEnd w:id="10"/>
+      <w:bookmarkStart w:id="11" w:name="ck_defc3a7a_32"/>
+      <w:bookmarkEnd w:id="11"/>
       <w:r>
         <w:rPr/>
         <w:t>Figure 1: A sine wave, standing in for a wake profile.</w:t>
@@ -3233,8 +3276,8 @@
         <w:jc w:val="center"/>
         <w:rPr/>
       </w:pPr>
-      <w:bookmarkStart w:id="11" w:name="ck_defc3a7a_38"/>
-      <w:bookmarkEnd w:id="11"/>
+      <w:bookmarkStart w:id="12" w:name="ck_defc3a7a_38"/>
+      <w:bookmarkEnd w:id="12"/>
       <w:r>
         <w:rPr/>
         <w:t>Tab</w:t>
@@ -3264,8 +3307,8 @@
         <w:jc w:val="left"/>
         <w:rPr/>
       </w:pPr>
-      <w:bookmarkStart w:id="12" w:name="ck_defc3a7a_40"/>
-      <w:bookmarkEnd w:id="12"/>
+      <w:bookmarkStart w:id="13" w:name="ck_defc3a7a_40"/>
+      <w:bookmarkEnd w:id="13"/>
       <w:r>
         <w:rPr>
           <w:rFonts w:eastAsia="Calibri" w:cs="Calibri" w:ascii="Calibri" w:hAnsi="Calibri"/>
@@ -3298,7 +3341,7 @@
               <wp:inline distT="0" distB="0" distL="0" distR="0">
                 <wp:extent cx="2146935" cy="6350"/>
                 <wp:effectExtent l="0" t="0" r="0" b="0"/>
-                <wp:docPr id="44" name="Group 1449"/>
+                <wp:docPr id="43" name="Group 1449"/>
                 <a:graphic xmlns:a="http://schemas.openxmlformats.org/drawingml/2006/main">
                   <a:graphicData uri="http://schemas.microsoft.com/office/word/2010/wordprocessingGroup">
                     <wpg:wgp>
@@ -3312,7 +3355,7 @@
                         </a:xfrm>
                       </wpg:grpSpPr>
                       <wps:wsp>
-                        <wps:cNvPr id="45" name="Shape 109"/>
+                        <wps:cNvPr id="44" name="Shape 109"/>
                         <wps:cNvSpPr/>
                         <wps:spPr>
                           <a:xfrm>
@@ -3321,15 +3364,9 @@
                           </a:xfrm>
                           <a:custGeom>
                             <a:avLst/>
-                            <a:gdLst>
-                              <a:gd name="textAreaLeft" fmla="*/ 0 w 1217160"/>
-                              <a:gd name="textAreaRight" fmla="*/ 1217520 w 1217160"/>
-                              <a:gd name="textAreaTop" fmla="*/ 0 h 3600"/>
-                              <a:gd name="textAreaBottom" fmla="*/ 3960 h 3600"/>
-                            </a:gdLst>
+                            <a:gdLst/>
                             <a:ahLst/>
-                            <a:cxnLst/>
-                            <a:rect l="textAreaLeft" t="textAreaTop" r="textAreaRight" b="textAreaBottom"/>
+                            <a:rect l="l" t="t" r="r" b="b"/>
                             <a:pathLst>
                               <a:path w="2147075" h="0">
                                 <a:moveTo>
@@ -3384,8 +3421,8 @@
         <w:jc w:val="left"/>
         <w:rPr/>
       </w:pPr>
-      <w:bookmarkStart w:id="13" w:name="ck_defc3a7a_40_2"/>
-      <w:bookmarkEnd w:id="13"/>
+      <w:bookmarkStart w:id="14" w:name="ck_defc3a7a_40_2"/>
+      <w:bookmarkEnd w:id="14"/>
       <w:r>
         <w:rPr>
           <w:rFonts w:eastAsia="Calibri" w:cs="Calibri" w:ascii="Calibri" w:hAnsi="Calibri"/>
@@ -3431,8 +3468,8 @@
         <w:jc w:val="left"/>
         <w:rPr/>
       </w:pPr>
-      <w:bookmarkStart w:id="14" w:name="ck_defc3a7a_40_3"/>
-      <w:bookmarkEnd w:id="14"/>
+      <w:bookmarkStart w:id="15" w:name="ck_defc3a7a_40_3"/>
+      <w:bookmarkEnd w:id="15"/>
       <w:r>
         <w:rPr>
           <w:rFonts w:eastAsia="Calibri" w:cs="Calibri" w:ascii="Calibri" w:hAnsi="Calibri"/>
@@ -3473,7 +3510,7 @@
               <wp:inline distT="0" distB="0" distL="0" distR="0">
                 <wp:extent cx="2146935" cy="10160"/>
                 <wp:effectExtent l="0" t="0" r="0" b="0"/>
-                <wp:docPr id="46" name="Group 1450"/>
+                <wp:docPr id="45" name="Group 1450"/>
                 <a:graphic xmlns:a="http://schemas.openxmlformats.org/drawingml/2006/main">
                   <a:graphicData uri="http://schemas.microsoft.com/office/word/2010/wordprocessingGroup">
                     <wpg:wgp>
@@ -3487,7 +3524,7 @@
                         </a:xfrm>
                       </wpg:grpSpPr>
                       <wps:wsp>
-                        <wps:cNvPr id="47" name="Shape 117"/>
+                        <wps:cNvPr id="46" name="Shape 117"/>
                         <wps:cNvSpPr/>
                         <wps:spPr>
                           <a:xfrm>
@@ -3496,15 +3533,9 @@
                           </a:xfrm>
                           <a:custGeom>
                             <a:avLst/>
-                            <a:gdLst>
-                              <a:gd name="textAreaLeft" fmla="*/ 0 w 1217160"/>
-                              <a:gd name="textAreaRight" fmla="*/ 1217520 w 1217160"/>
-                              <a:gd name="textAreaTop" fmla="*/ 0 h 5760"/>
-                              <a:gd name="textAreaBottom" fmla="*/ 6120 h 5760"/>
-                            </a:gdLst>
+                            <a:gdLst/>
                             <a:ahLst/>
-                            <a:cxnLst/>
-                            <a:rect l="textAreaLeft" t="textAreaTop" r="textAreaRight" b="textAreaBottom"/>
+                            <a:rect l="l" t="t" r="r" b="b"/>
                             <a:pathLst>
                               <a:path w="2147075" h="0">
                                 <a:moveTo>
@@ -3552,8 +3583,8 @@
         <w:ind w:hanging="484" w:left="633"/>
         <w:rPr/>
       </w:pPr>
-      <w:bookmarkStart w:id="15" w:name="ck_defc3a7a_50"/>
-      <w:bookmarkEnd w:id="15"/>
+      <w:bookmarkStart w:id="16" w:name="ck_defc3a7a_50"/>
+      <w:bookmarkEnd w:id="16"/>
       <w:r>
         <w:rPr/>
         <w:t>Conclusions</w:t>
@@ -3566,8 +3597,8 @@
         <w:ind w:hanging="10" w:left="159"/>
         <w:rPr/>
       </w:pPr>
-      <w:bookmarkStart w:id="16" w:name="ck_defc3a7a_52"/>
-      <w:bookmarkEnd w:id="16"/>
+      <w:bookmarkStart w:id="17" w:name="ck_defc3a7a_52"/>
+      <w:bookmarkEnd w:id="17"/>
       <w:r>
         <w:rPr/>
         <w:t xml:space="preserve">The model in Eq. (1) fits the data in Sec. 2 </w:t>
@@ -3664,7 +3695,7 @@
     <w:sectPr>
       <w:type w:val="continuous"/>
       <w:pgSz w:w="12240" w:h="15840"/>
-      <w:pgMar w:left="3441" w:right="3456" w:gutter="0" w:header="0" w:top="3094" w:footer="0" w:bottom="1440"/>
+      <w:pgMar w:left="1440" w:right="1455" w:gutter="0" w:header="0" w:top="3094" w:footer="0" w:bottom="1440"/>
       <w:cols w:num="2" w:space="50" w:equalWidth="true" w:sep="false"/>
       <w:formProt w:val="false"/>
       <w:textDirection w:val="lrTb"/>
@@ -3679,50 +3710,6 @@
   <w:comment w:id="1" w:author="T. Author" w:initials="">
     <w:p>
       <w:pPr>
-        <w:overflowPunct w:val="true"/>
-        <w:spacing w:before="0" w:after="0" w:lineRule="auto" w:line="240"/>
-        <w:jc w:val="left"/>
-        <w:rPr/>
-      </w:pPr>
-      <w:r>
-        <w:annotationRef/>
-      </w:r>
-      <w:r>
-        <w:rPr>
-          <w:rFonts w:asciiTheme="minorHAnsi" w:cstheme="minorBidi" w:eastAsiaTheme="minorEastAsia" w:hAnsiTheme="minorHAnsi" w:eastAsia="" w:cs="" w:ascii="Aptos" w:hAnsi="Aptos"/>
-          <w:color w:val="auto"/>
-          <w:sz w:val="24"/>
-          <w14:ligatures w14:val="standardContextual"/>
-        </w:rPr>
-        <w:t>Is this the right model for near wake?</w:t>
-      </w:r>
-    </w:p>
-  </w:comment>
-  <w:comment w:id="0" w:author="P. Bachant" w:initials="">
-    <w:p>
-      <w:pPr>
-        <w:overflowPunct w:val="true"/>
-        <w:spacing w:before="0" w:after="0" w:lineRule="auto" w:line="240"/>
-        <w:jc w:val="left"/>
-        <w:rPr/>
-      </w:pPr>
-      <w:r>
-        <w:annotationRef/>
-      </w:r>
-      <w:r>
-        <w:rPr>
-          <w:rFonts w:asciiTheme="minorHAnsi" w:cstheme="minorBidi" w:eastAsiaTheme="minorEastAsia" w:hAnsiTheme="minorHAnsi" w:eastAsia="" w:cs="" w:ascii="Aptos" w:hAnsi="Aptos"/>
-          <w:color w:val="auto"/>
-          <w:sz w:val="24"/>
-          <w14:ligatures w14:val="standardContextual"/>
-        </w:rPr>
-        <w:t>Probably fine for x/D &gt; 3.</w:t>
-      </w:r>
-    </w:p>
-  </w:comment>
-  <w:comment w:id="2" w:author="Libre Reviewer" w:initials="">
-    <w:p>
-      <w:pPr>
         <w:overflowPunct w:val="false"/>
         <w:spacing w:lineRule="auto" w:line="240" w:before="0" w:after="0"/>
         <w:jc w:val="left"/>
@@ -3738,6 +3725,38 @@
           <w:sz w:val="24"/>
           <w14:ligatures w14:val="standardContextual"/>
         </w:rPr>
+        <w:t>Is this the right model for near wake?</w:t>
+      </w:r>
+    </w:p>
+  </w:comment>
+  <w:comment w:id="0" w:author="P. Bachant" w:initials="">
+    <w:p>
+      <w:pPr>
+        <w:overflowPunct w:val="false"/>
+        <w:spacing w:lineRule="auto" w:line="240" w:before="0" w:after="0"/>
+        <w:jc w:val="left"/>
+        <w:rPr/>
+      </w:pPr>
+      <w:r>
+        <w:annotationRef/>
+      </w:r>
+      <w:r>
+        <w:rPr>
+          <w:rFonts w:asciiTheme="minorHAnsi" w:cstheme="minorBidi" w:eastAsiaTheme="minorEastAsia" w:hAnsiTheme="minorHAnsi" w:cs="" w:eastAsia="" w:ascii="Aptos" w:hAnsi="Aptos"/>
+          <w:color w:val="auto"/>
+          <w:sz w:val="24"/>
+          <w14:ligatures w14:val="standardContextual"/>
+        </w:rPr>
+        <w:t>Probably fine for x/D &gt; 3.</w:t>
+      </w:r>
+    </w:p>
+  </w:comment>
+  <w:comment w:id="2" w:author="Libre Reviewer" w:initials="">
+    <w:p>
+      <w:r>
+        <w:annotationRef/>
+      </w:r>
+      <w:r>
         <w:t>Quantify this.</w:t>
       </w:r>
     </w:p>
@@ -4407,7 +4426,6 @@
     <w:qFormat/>
     <w:pPr>
       <w:widowControl/>
-      <w:suppressAutoHyphens w:val="true"/>
       <w:bidi w:val="0"/>
       <w:spacing w:lineRule="auto" w:line="262" w:before="0" w:after="20"/>
       <w:ind w:hanging="10" w:left="10"/>
@@ -4436,7 +4454,6 @@
         <w:ilvl w:val="0"/>
         <w:numId w:val="1"/>
       </w:numPr>
-      <w:suppressAutoHyphens w:val="true"/>
       <w:bidi w:val="0"/>
       <w:spacing w:lineRule="auto" w:line="259" w:before="0" w:after="155"/>
       <w:ind w:hanging="10" w:left="10"/>
@@ -4530,19 +4547,26 @@
       <w:rFonts w:cs="Arial Unicode MS"/>
     </w:rPr>
   </w:style>
-  <w:style w:type="paragraph" w:styleId="FrameContentsuser">
-    <w:name w:val="Frame Contents (user)"/>
-    <w:basedOn w:val="Normal"/>
-    <w:qFormat/>
-    <w:pPr/>
-    <w:rPr/>
-  </w:style>
   <w:style w:type="paragraph" w:styleId="FrameContents">
     <w:name w:val="Frame Contents"/>
     <w:basedOn w:val="Normal"/>
     <w:qFormat/>
     <w:pPr/>
     <w:rPr/>
+  </w:style>
+  <w:style w:type="paragraph" w:styleId="Comment">
+    <w:name w:val="Comment"/>
+    <w:basedOn w:val="Normal"/>
+    <w:qFormat/>
+    <w:pPr>
+      <w:spacing w:lineRule="auto" w:line="240" w:before="56" w:after="0"/>
+      <w:ind w:hanging="0" w:left="57" w:right="57"/>
+    </w:pPr>
+    <w:rPr>
+      <w:color w:val="auto"/>
+      <w:sz w:val="20"/>
+      <w:szCs w:val="20"/>
+    </w:rPr>
   </w:style>
   <w:style w:type="numbering" w:styleId="NoList" w:default="1">
     <w:name w:val="No List"/>
@@ -4741,7 +4765,7 @@
 </file>
 
 <file path=customXml/item1.xml><?xml version="1.0" encoding="utf-8"?>
-<ns0:review xmlns:ns0="https://calkit.org/latex-export" id="e2ec1186-1172-46d4-b06b-979f9213217e" source="paper/main.tex">
+<ns0:review xmlns:ns0="https://calkit.org/latex-export" id="40c318a5-ee48-44c1-a4b7-33b5eca35788" source="paper/main.tex">
   <ns0:p id="ck_defc3a7a_1">Wake recovery behind a model turbine</ns0:p>
   <ns0:p id="ck_defc3a7a_1_2">P. Bachant A. Reviewer</ns0:p>
   <ns0:p id="ck_defc3a7a_10">Abstract</ns0:p>
@@ -4751,7 +4775,7 @@
   <ns0:p id="ck_dcf9e526_1">Methods</ns0:p>
   <ns0:p id="ck_dcf9e526_4">We measured the velocity field with a two-component laser Doppler velocimeter [Lee, 2018]. The sampling frequency was fs = 1 kHz and the integral time scale was estimated from the autocorrelation.</ns0:p>
   <ns0:p id="ck_dcf9e526_14">The mean velocity deficit is modeled as</ns0:p>
-  <ns0:p id="ck_dcf9e526_18">where CT is the thrust coefficient and k is the wake growth rate. Figure 1 shows the result, and Table 1 lists the parameters.</ns0:p>
+  <ns0:p id="ck_dcf9e526_19">where CT is the thrust coefficient and k is the wake growth rate. Figure 1 shows the result, and Table 1 lists the parameters.</ns0:p>
   <ns0:p id="ck_defc3a7a_32">Figure 1: A sine wave, standing in for a wake profile.</ns0:p>
   <ns0:p id="ck_defc3a7a_38">Table 1: Parameters used in the wake model.</ns0:p>
   <ns0:p id="ck_defc3a7a_40">Parameter Symbol Value</ns0:p>
@@ -4759,12 +4783,12 @@
   <ns0:p id="ck_defc3a7a_40_3">Growth rate k 0.05</ns0:p>
   <ns0:p id="ck_defc3a7a_50">Conclusions</ns0:p>
   <ns0:p id="ck_defc3a7a_52">The model in Eq. (1) fits the data in Sec. 2 reasonably well.</ns0:p>
-  <ns0:media name="word/media/image1.png" sha1="d9d2ebbcd153e474fe0adb4e8fd78842a3d12d11"/>
+  <ns0:eq id="ck_dcf9e526_15">\frac{\Delta U}{U_{\infty}} = \frac{C_{T}}{8(1 + kx/D)^{2}},</ns0:eq>
 </ns0:review>
 </file>
 
 <file path=customXml/itemProps1.xml><?xml version="1.0" encoding="utf-8"?>
-<ds:datastoreItem xmlns:ds="http://schemas.openxmlformats.org/officeDocument/2006/customXml" ds:itemID="{E2EC1186-1172-46D4-B06B-979F9213217E}">
+<ds:datastoreItem xmlns:ds="http://schemas.openxmlformats.org/officeDocument/2006/customXml" ds:itemID="{40C318A5-EE48-44C1-A4B7-33B5ECA35788}">
   <ds:schemaRefs>
     <ds:schemaRef ds:uri="https://calkit.org/latex-export"/>
   </ds:schemaRefs>

</xml_diff>

<commit_message>
Add a LibreOffice engine for Word exports using TeX4ht
</commit_message>
<xml_diff>
--- a/test/docx/libreoffice-accepted.docx
+++ b/test/docx/libreoffice-accepted.docx
@@ -4765,7 +4765,7 @@
 </file>
 
 <file path=customXml/item1.xml><?xml version="1.0" encoding="utf-8"?>
-<ns0:review xmlns:ns0="https://calkit.org/latex-export" id="40c318a5-ee48-44c1-a4b7-33b5eca35788" source="paper/main.tex">
+<ns0:review xmlns:ns0="https://calkit.org/latex-export" id="66df5852-429d-4fa7-abc3-4fb50a9866ac" source="paper/main.tex">
   <ns0:p id="ck_defc3a7a_1">Wake recovery behind a model turbine</ns0:p>
   <ns0:p id="ck_defc3a7a_1_2">P. Bachant A. Reviewer</ns0:p>
   <ns0:p id="ck_defc3a7a_10">Abstract</ns0:p>
@@ -4788,7 +4788,7 @@
 </file>
 
 <file path=customXml/itemProps1.xml><?xml version="1.0" encoding="utf-8"?>
-<ds:datastoreItem xmlns:ds="http://schemas.openxmlformats.org/officeDocument/2006/customXml" ds:itemID="{40C318A5-EE48-44C1-A4B7-33B5ECA35788}">
+<ds:datastoreItem xmlns:ds="http://schemas.openxmlformats.org/officeDocument/2006/customXml" ds:itemID="{66DF5852-429D-4FA7-ABC3-4FB50A9866AC}">
   <ds:schemaRefs>
     <ds:schemaRef ds:uri="https://calkit.org/latex-export"/>
   </ds:schemaRefs>

</xml_diff>